<commit_message>
docs(HCO v2): COP policy fixes plus Records and SOPs package
</commit_message>
<xml_diff>
--- a/policies/build/chapters_v2/COP/HCO_COP_10_v2_REWRITE_DRAFT.docx
+++ b/policies/build/chapters_v2/COP/HCO_COP_10_v2_REWRITE_DRAFT.docx
@@ -1985,7 +1985,19 @@
         <w:pStyle w:val="ListNumber"/>
       </w:pPr>
       <w:r>
-        <w:t>Assisted Reproductive Technology (Regulation) Act as amended (reference for COP.10.k ART compliance requirements).</w:t>
+        <w:t xml:space="preserve">Government of India. (2021). </w:t>
+      </w:r>
+      <w:hyperlink r:id="rId9">
+        <w:r>
+          <w:rPr>
+            <w:color w:val="0563C1"/>
+            <w:u w:val="single"/>
+          </w:rPr>
+          <w:t>https://www.indiacode.nic.in/bitstream/123456789/17031/1/aA2021-42.pdf</w:t>
+        </w:r>
+      </w:hyperlink>
+      <w:r>
+        <w:t xml:space="preserve"> The Assisted Reproductive Technology (Regulation) Act, 2021 — reference for COP.10.k ART compliance requirements.</w:t>
       </w:r>
     </w:p>
     <w:p>
@@ -1997,9 +2009,23 @@
       </w:r>
     </w:p>
     <w:p>
-      <w:pPr/>
       <w:r>
-        <w:t>This policy reorganises the supplied COP.10 objective elements and approved plain-language content into policy format. The stop-work text is reproduced exactly as supplied. Mandatory requirements and their stated modal strength have been retained. The three minimum written-guidance areas (COP.10.a), four minimum ante-natal written-guidance areas (COP.10.d), three minimum monitoring items (COP.10.i), and six ART scope elements (infrastructure, ART lab, operation theatre, competent team, consent process, screening/SOPs) are preserved exactly as stated. COP.10.j (NICU) and COP.10.k (ART) are explicitly presented as scope-conditional, not universal requirements.</w:t>
+        <w:t>This document is a template prepared for the guidance of «Hospital Name» and must be reviewed, adapted and formally approved by «Hospital Name» before use. Every entry marked ________ must be completed before the document is issued.</w:t>
+      </w:r>
+    </w:p>
+    <w:p>
+      <w:r>
+        <w:t>The requirements in this document are accreditation requirements of the NABH Full Accreditation Standards for Hospitals, 6th Edition, not duties under a named Act of Parliament. Statutory duties that arise under other documents of «Hospital Name» remain those documents. «Hospital Name» is responsible for verifying any statutory duty that applies to it; this document does not constitute legal advice.</w:t>
+      </w:r>
+    </w:p>
+    <w:p>
+      <w:r>
+        <w:t>The clinical and technical content reflects recognised national and international guidance current at the date of preparation. «Hospital Name» remains responsible for verifying that it is current and consistent with the edition of the accreditation standard against which it is being assessed.</w:t>
+      </w:r>
+    </w:p>
+    <w:p>
+      <w:r>
+        <w:t>This document is not issued by, endorsed by, or affiliated with NABH or any other body named in it. Wording is original; no text has been reproduced from the standards, rules or guidelines referenced.</w:t>
       </w:r>
     </w:p>
     <w:sectPr>

</xml_diff>